<commit_message>
Align report with reproducible code
</commit_message>
<xml_diff>
--- a/GridVeil_Report.docx
+++ b/GridVeil_Report.docx
@@ -1,5 +1,47 @@
 
-<file path=word/document.xml><?xml version="1.0" encoding="utf-8"?>
+<file path=docProps\app.xml><?xml version="1.0" encoding="utf-8"?>
+<Properties xmlns="http://schemas.openxmlformats.org/officeDocument/2006/extended-properties" xmlns:vt="http://schemas.openxmlformats.org/officeDocument/2006/docPropsVTypes">
+  <Template>Normal</Template>
+  <TotalTime>0</TotalTime>
+  <Application>Microsoft Office Word</Application>
+  <DocSecurity>0</DocSecurity>
+  <ScaleCrop>false</ScaleCrop>
+  <LinksUpToDate>false</LinksUpToDate>
+  <SharedDoc>false</SharedDoc>
+  <HyperlinksChanged>false</HyperlinksChanged>
+  <AppVersion>12.0000</AppVersion>
+</Properties>
+</file>
+
+<file path=docProps\core.xml><?xml version="1.0" encoding="utf-8"?>
+<cp:coreProperties xmlns:cp="http://schemas.openxmlformats.org/package/2006/metadata/core-properties" xmlns:dc="http://purl.org/dc/elements/1.1/" xmlns:dcterms="http://purl.org/dc/terms/" xmlns:dcmitype="http://purl.org/dc/dcmitype/" xmlns:xsi="http://www.w3.org/2001/XMLSchema-instance">
+  <dc:creator>Un-named</dc:creator>
+  <dcterms:created xsi:type="dcterms:W3CDTF">2026-09-25T20:13:46Z</dcterms:created>
+  <dcterms:modified xsi:type="dcterms:W3CDTF">2026-09-25T20:13:46Z</dcterms:modified>
+</cp:coreProperties>
+</file>
+
+<file path=docProps\custom.xml><?xml version="1.0" encoding="utf-8"?>
+<Properties xmlns="http://schemas.openxmlformats.org/officeDocument/2006/custom-properties" xmlns:vt="http://schemas.openxmlformats.org/officeDocument/2006/docPropsVTypes">
+  <property fmtid="{D5CDD505-2E9C-101B-9397-08002B2CF9AE}" pid="2" name="Converter">
+    <vt:lpwstr>StructuredOutput v12.0.20182.1</vt:lpwstr>
+  </property>
+  <property fmtid="{D5CDD505-2E9C-101B-9397-08002B2CF9AE}" pid="3" name="Created">
+    <vt:filetime>2026-09-25T00:00:00Z</vt:filetime>
+  </property>
+  <property fmtid="{D5CDD505-2E9C-101B-9397-08002B2CF9AE}" pid="4" name="Creator">
+    <vt:lpwstr>Microsoft® Word 2016</vt:lpwstr>
+  </property>
+  <property fmtid="{D5CDD505-2E9C-101B-9397-08002B2CF9AE}" pid="5" name="LastSaved">
+    <vt:filetime>2026-09-25T00:00:00Z</vt:filetime>
+  </property>
+  <property fmtid="{D5CDD505-2E9C-101B-9397-08002B2CF9AE}" pid="6" name="Producer">
+    <vt:lpwstr>Microsoft® Word 2016</vt:lpwstr>
+  </property>
+</Properties>
+</file>
+
+<file path=word\document.xml><?xml version="1.0" encoding="utf-8"?>
 <w:document xmlns:mc="http://schemas.openxmlformats.org/markup-compatibility/2006" xmlns:ve="http://schemas.openxmlformats.org/markup-compatibility/2006" xmlns:o="urn:schemas-microsoft-com:office:office" xmlns:r="http://schemas.openxmlformats.org/officeDocument/2006/relationships" xmlns:m="http://schemas.openxmlformats.org/officeDocument/2006/math" xmlns:v="urn:schemas-microsoft-com:vml" xmlns:wp="http://schemas.openxmlformats.org/drawingml/2006/wordprocessingDrawing" xmlns:w10="urn:schemas-microsoft-com:office:word" xmlns:w="http://schemas.openxmlformats.org/wordprocessingml/2006/main" xmlns:wne="http://schemas.microsoft.com/office/word/2006/wordml" xmlns:a="http://schemas.openxmlformats.org/drawingml/2006/main" xmlns:pic="http://schemas.openxmlformats.org/drawingml/2006/picture" xmlns:wpg="http://schemas.microsoft.com/office/word/2010/wordprocessingGroup" xmlns:wps="http://schemas.microsoft.com/office/word/2010/wordprocessingShape" xmlns:w14="http://schemas.microsoft.com/office/word/2010/wordml" mc:Ignorable="w14" xml:space="preserve">
   <w:body>
     <w:p>
@@ -6965,7 +7007,7 @@
         <w:rPr>
           <w:color w:val="212121"/>
         </w:rPr>
-        <w:t>chronological train/validation/test split and a 4-hour (24-step) lookback window, achieving a test Mean Absolute Percentage Error (MAPE) of 2.69%, a substantial improvement over a Random Forest baseline (5.77% </w:t>
+        <w:t>chronological train/validation/test split and a 4-hour (24-step) lookback window, reporting a test Mean Absolute Percentage Error (MAPE) of 2.42%; the repository includes a Random Forest baseline script, but no RF result is claimed until it is run.</w:t>
       </w:r>
       <w:r>
         <w:rPr>
@@ -6986,7 +7028,7 @@
         <w:rPr>
           <w:color w:val="212121"/>
         </w:rPr>
-        <w:t>An anomaly detection layer built on a dynamically computed, data-driven threshold (the 95th percentile of the model's training error) flagged 7,834 anomalous observations in the test set, exposing unusual consumption behaviour without relying on fixed, arbitrary cutoffs. A companion Differential Privacy experiment quantified the accuracy cost of protecting individual-level consumption data: introducing Laplace noise at ε = 1.0 to a synthetic Libyan pattern load series raised forecasting error from 5.57% to 7.24% MAPE</w:t>
+        <w:t>An anomaly detection layer uses the 95th percentile of training absolute error after inverse-scaling to the original MW units and flags approximately 179 test observations in the corrected evaluation. The repository includes a reproducible Laplace label-perturbation experiment; the original DP figures are not claimed as reproducible results.</w:t>
       </w:r>
       <w:r>
         <w:rPr>
@@ -30919,7 +30961,7 @@
                 <w:spacing w:val="-2"/>
                 <w:sz w:val="20"/>
               </w:rPr>
-              <w:t>5.77%</w:t>
+              <w:t>Not verified</w:t>
             </w:r>
           </w:p>
         </w:tc>
@@ -30940,7 +30982,7 @@
                 <w:spacing w:val="-2"/>
                 <w:sz w:val="20"/>
               </w:rPr>
-              <w:t>2.69%</w:t>
+              <w:t>2.42%</w:t>
             </w:r>
           </w:p>
         </w:tc>
@@ -31205,7 +31247,7 @@
                 <w:spacing w:val="-2"/>
                 <w:sz w:val="20"/>
               </w:rPr>
-              <w:t>0.421</w:t>
+              <w:t>Dynamic MW threshold</w:t>
             </w:r>
           </w:p>
         </w:tc>
@@ -31314,7 +31356,7 @@
                 <w:spacing w:val="-2"/>
                 <w:sz w:val="20"/>
               </w:rPr>
-              <w:t>7,834</w:t>
+              <w:t>Approx. 179</w:t>
             </w:r>
           </w:p>
         </w:tc>
@@ -32059,7 +32101,7 @@
                 <w:spacing w:val="-2"/>
                 <w:sz w:val="20"/>
               </w:rPr>
-              <w:t>5.57%</w:t>
+              <w:t>Not reproduced</w:t>
             </w:r>
           </w:p>
         </w:tc>
@@ -32198,7 +32240,7 @@
                 <w:spacing w:val="-2"/>
                 <w:sz w:val="20"/>
               </w:rPr>
-              <w:t>7.24%</w:t>
+              <w:t>Not reproduced</w:t>
             </w:r>
           </w:p>
         </w:tc>
@@ -32221,462 +32263,462 @@
         <w:rPr>
           <w:color w:val="212121"/>
         </w:rPr>
-        <w:t>At</w:t>
+        <w:t>At epsilon = 1.0, the original differential-privacy figures are not reproduced by this repository; see dp_experiment.py for the available label-perturbation experiment and its stated limitations.</w:t>
       </w:r>
       <w:r>
         <w:rPr>
           <w:color w:val="212121"/>
           <w:spacing w:val="-7"/>
         </w:rPr>
-        <w:t> </w:t>
-      </w:r>
-      <w:r>
-        <w:rPr>
-          <w:color w:val="212121"/>
-        </w:rPr>
-        <w:t>ε</w:t>
+        <w:t/>
+      </w:r>
+      <w:r>
+        <w:rPr>
+          <w:color w:val="212121"/>
+        </w:rPr>
+        <w:t/>
       </w:r>
       <w:r>
         <w:rPr>
           <w:color w:val="212121"/>
           <w:spacing w:val="-8"/>
         </w:rPr>
-        <w:t> </w:t>
-      </w:r>
-      <w:r>
-        <w:rPr>
-          <w:color w:val="212121"/>
-        </w:rPr>
-        <w:t>=</w:t>
+        <w:t/>
+      </w:r>
+      <w:r>
+        <w:rPr>
+          <w:color w:val="212121"/>
+        </w:rPr>
+        <w:t/>
       </w:r>
       <w:r>
         <w:rPr>
           <w:color w:val="212121"/>
           <w:spacing w:val="-10"/>
         </w:rPr>
-        <w:t> </w:t>
-      </w:r>
-      <w:r>
-        <w:rPr>
-          <w:color w:val="212121"/>
-        </w:rPr>
-        <w:t>1.0,</w:t>
+        <w:t/>
+      </w:r>
+      <w:r>
+        <w:rPr>
+          <w:color w:val="212121"/>
+        </w:rPr>
+        <w:t/>
       </w:r>
       <w:r>
         <w:rPr>
           <w:color w:val="212121"/>
           <w:spacing w:val="-8"/>
         </w:rPr>
-        <w:t> </w:t>
-      </w:r>
-      <w:r>
-        <w:rPr>
-          <w:color w:val="212121"/>
-        </w:rPr>
-        <w:t>protecting</w:t>
+        <w:t/>
+      </w:r>
+      <w:r>
+        <w:rPr>
+          <w:color w:val="212121"/>
+        </w:rPr>
+        <w:t/>
       </w:r>
       <w:r>
         <w:rPr>
           <w:color w:val="212121"/>
           <w:spacing w:val="-9"/>
         </w:rPr>
-        <w:t> </w:t>
-      </w:r>
-      <w:r>
-        <w:rPr>
-          <w:color w:val="212121"/>
-        </w:rPr>
-        <w:t>the</w:t>
+        <w:t/>
+      </w:r>
+      <w:r>
+        <w:rPr>
+          <w:color w:val="212121"/>
+        </w:rPr>
+        <w:t/>
       </w:r>
       <w:r>
         <w:rPr>
           <w:color w:val="212121"/>
           <w:spacing w:val="-8"/>
         </w:rPr>
-        <w:t> </w:t>
-      </w:r>
-      <w:r>
-        <w:rPr>
-          <w:color w:val="212121"/>
-        </w:rPr>
-        <w:t>data</w:t>
+        <w:t/>
+      </w:r>
+      <w:r>
+        <w:rPr>
+          <w:color w:val="212121"/>
+        </w:rPr>
+        <w:t/>
       </w:r>
       <w:r>
         <w:rPr>
           <w:color w:val="212121"/>
           <w:spacing w:val="-9"/>
         </w:rPr>
-        <w:t> </w:t>
-      </w:r>
-      <w:r>
-        <w:rPr>
-          <w:color w:val="212121"/>
-        </w:rPr>
-        <w:t>increased</w:t>
+        <w:t/>
+      </w:r>
+      <w:r>
+        <w:rPr>
+          <w:color w:val="212121"/>
+        </w:rPr>
+        <w:t/>
       </w:r>
       <w:r>
         <w:rPr>
           <w:color w:val="212121"/>
           <w:spacing w:val="-8"/>
         </w:rPr>
-        <w:t> </w:t>
-      </w:r>
-      <w:r>
-        <w:rPr>
-          <w:color w:val="212121"/>
-        </w:rPr>
-        <w:t>forecasting</w:t>
+        <w:t/>
+      </w:r>
+      <w:r>
+        <w:rPr>
+          <w:color w:val="212121"/>
+        </w:rPr>
+        <w:t/>
       </w:r>
       <w:r>
         <w:rPr>
           <w:color w:val="212121"/>
           <w:spacing w:val="-9"/>
         </w:rPr>
-        <w:t> </w:t>
-      </w:r>
-      <w:r>
-        <w:rPr>
-          <w:color w:val="212121"/>
-        </w:rPr>
-        <w:t>error</w:t>
+        <w:t/>
+      </w:r>
+      <w:r>
+        <w:rPr>
+          <w:color w:val="212121"/>
+        </w:rPr>
+        <w:t/>
       </w:r>
       <w:r>
         <w:rPr>
           <w:color w:val="212121"/>
           <w:spacing w:val="-10"/>
         </w:rPr>
-        <w:t> </w:t>
-      </w:r>
-      <w:r>
-        <w:rPr>
-          <w:color w:val="212121"/>
-        </w:rPr>
-        <w:t>by</w:t>
+        <w:t/>
+      </w:r>
+      <w:r>
+        <w:rPr>
+          <w:color w:val="212121"/>
+        </w:rPr>
+        <w:t/>
       </w:r>
       <w:r>
         <w:rPr>
           <w:color w:val="212121"/>
           <w:spacing w:val="-8"/>
         </w:rPr>
-        <w:t> </w:t>
-      </w:r>
-      <w:r>
-        <w:rPr>
-          <w:color w:val="212121"/>
-        </w:rPr>
-        <w:t>roughly</w:t>
+        <w:t/>
+      </w:r>
+      <w:r>
+        <w:rPr>
+          <w:color w:val="212121"/>
+        </w:rPr>
+        <w:t/>
       </w:r>
       <w:r>
         <w:rPr>
           <w:color w:val="212121"/>
           <w:spacing w:val="-8"/>
         </w:rPr>
-        <w:t> </w:t>
-      </w:r>
-      <w:r>
-        <w:rPr>
-          <w:color w:val="212121"/>
-        </w:rPr>
-        <w:t>30%</w:t>
+        <w:t/>
+      </w:r>
+      <w:r>
+        <w:rPr>
+          <w:color w:val="212121"/>
+        </w:rPr>
+        <w:t/>
       </w:r>
       <w:r>
         <w:rPr>
           <w:color w:val="212121"/>
           <w:spacing w:val="-8"/>
         </w:rPr>
-        <w:t> </w:t>
-      </w:r>
-      <w:r>
-        <w:rPr>
-          <w:color w:val="212121"/>
-        </w:rPr>
-        <w:t>in</w:t>
+        <w:t/>
+      </w:r>
+      <w:r>
+        <w:rPr>
+          <w:color w:val="212121"/>
+        </w:rPr>
+        <w:t/>
       </w:r>
       <w:r>
         <w:rPr>
           <w:color w:val="212121"/>
           <w:spacing w:val="-12"/>
         </w:rPr>
-        <w:t> </w:t>
-      </w:r>
-      <w:r>
-        <w:rPr>
-          <w:color w:val="212121"/>
-        </w:rPr>
-        <w:t>relative</w:t>
+        <w:t/>
+      </w:r>
+      <w:r>
+        <w:rPr>
+          <w:color w:val="212121"/>
+        </w:rPr>
+        <w:t/>
       </w:r>
       <w:r>
         <w:rPr>
           <w:color w:val="212121"/>
           <w:spacing w:val="-8"/>
         </w:rPr>
-        <w:t> </w:t>
-      </w:r>
-      <w:r>
-        <w:rPr>
-          <w:color w:val="212121"/>
-        </w:rPr>
-        <w:t>terms</w:t>
+        <w:t/>
+      </w:r>
+      <w:r>
+        <w:rPr>
+          <w:color w:val="212121"/>
+        </w:rPr>
+        <w:t/>
       </w:r>
       <w:r>
         <w:rPr>
           <w:color w:val="212121"/>
           <w:spacing w:val="-9"/>
         </w:rPr>
-        <w:t> </w:t>
-      </w:r>
-      <w:r>
-        <w:rPr>
-          <w:color w:val="212121"/>
-        </w:rPr>
-        <w:t>(5.57%</w:t>
+        <w:t/>
+      </w:r>
+      <w:r>
+        <w:rPr>
+          <w:color w:val="212121"/>
+        </w:rPr>
+        <w:t/>
       </w:r>
       <w:r>
         <w:rPr>
           <w:color w:val="212121"/>
           <w:spacing w:val="-10"/>
         </w:rPr>
-        <w:t> </w:t>
-      </w:r>
-      <w:r>
-        <w:rPr>
-          <w:color w:val="212121"/>
-        </w:rPr>
-        <w:t>→</w:t>
+        <w:t/>
+      </w:r>
+      <w:r>
+        <w:rPr>
+          <w:color w:val="212121"/>
+        </w:rPr>
+        <w:t/>
       </w:r>
       <w:r>
         <w:rPr>
           <w:color w:val="212121"/>
           <w:spacing w:val="-8"/>
         </w:rPr>
-        <w:t> </w:t>
-      </w:r>
-      <w:r>
-        <w:rPr>
-          <w:color w:val="212121"/>
-        </w:rPr>
-        <w:t>7.24% MAPE).</w:t>
+        <w:t/>
+      </w:r>
+      <w:r>
+        <w:rPr>
+          <w:color w:val="212121"/>
+        </w:rPr>
+        <w:t/>
       </w:r>
       <w:r>
         <w:rPr>
           <w:color w:val="212121"/>
           <w:spacing w:val="-11"/>
         </w:rPr>
-        <w:t> </w:t>
-      </w:r>
-      <w:r>
-        <w:rPr>
-          <w:color w:val="212121"/>
-        </w:rPr>
-        <w:t>Because</w:t>
+        <w:t/>
+      </w:r>
+      <w:r>
+        <w:rPr>
+          <w:color w:val="212121"/>
+        </w:rPr>
+        <w:t/>
       </w:r>
       <w:r>
         <w:rPr>
           <w:color w:val="212121"/>
           <w:spacing w:val="-10"/>
         </w:rPr>
-        <w:t> </w:t>
-      </w:r>
-      <w:r>
-        <w:rPr>
-          <w:color w:val="212121"/>
-        </w:rPr>
-        <w:t>the</w:t>
+        <w:t/>
+      </w:r>
+      <w:r>
+        <w:rPr>
+          <w:color w:val="212121"/>
+        </w:rPr>
+        <w:t/>
       </w:r>
       <w:r>
         <w:rPr>
           <w:color w:val="212121"/>
           <w:spacing w:val="-8"/>
         </w:rPr>
-        <w:t> </w:t>
-      </w:r>
-      <w:r>
-        <w:rPr>
-          <w:color w:val="212121"/>
-        </w:rPr>
-        <w:t>Laplace</w:t>
+        <w:t/>
+      </w:r>
+      <w:r>
+        <w:rPr>
+          <w:color w:val="212121"/>
+        </w:rPr>
+        <w:t/>
       </w:r>
       <w:r>
         <w:rPr>
           <w:color w:val="212121"/>
           <w:spacing w:val="-10"/>
         </w:rPr>
-        <w:t> </w:t>
-      </w:r>
-      <w:r>
-        <w:rPr>
-          <w:color w:val="212121"/>
-        </w:rPr>
-        <w:t>noise</w:t>
+        <w:t/>
+      </w:r>
+      <w:r>
+        <w:rPr>
+          <w:color w:val="212121"/>
+        </w:rPr>
+        <w:t/>
       </w:r>
       <w:r>
         <w:rPr>
           <w:color w:val="212121"/>
           <w:spacing w:val="-8"/>
         </w:rPr>
-        <w:t> </w:t>
-      </w:r>
-      <w:r>
-        <w:rPr>
-          <w:color w:val="212121"/>
-        </w:rPr>
-        <w:t>scale</w:t>
+        <w:t/>
+      </w:r>
+      <w:r>
+        <w:rPr>
+          <w:color w:val="212121"/>
+        </w:rPr>
+        <w:t/>
       </w:r>
       <w:r>
         <w:rPr>
           <w:color w:val="212121"/>
           <w:spacing w:val="-8"/>
         </w:rPr>
-        <w:t> </w:t>
-      </w:r>
-      <w:r>
-        <w:rPr>
-          <w:color w:val="212121"/>
-        </w:rPr>
-        <w:t>is</w:t>
+        <w:t/>
+      </w:r>
+      <w:r>
+        <w:rPr>
+          <w:color w:val="212121"/>
+        </w:rPr>
+        <w:t/>
       </w:r>
       <w:r>
         <w:rPr>
           <w:color w:val="212121"/>
           <w:spacing w:val="-10"/>
         </w:rPr>
-        <w:t> </w:t>
-      </w:r>
-      <w:r>
-        <w:rPr>
-          <w:color w:val="212121"/>
-        </w:rPr>
-        <w:t>fixed</w:t>
+        <w:t/>
+      </w:r>
+      <w:r>
+        <w:rPr>
+          <w:color w:val="212121"/>
+        </w:rPr>
+        <w:t/>
       </w:r>
       <w:r>
         <w:rPr>
           <w:color w:val="212121"/>
           <w:spacing w:val="-11"/>
         </w:rPr>
-        <w:t> </w:t>
-      </w:r>
-      <w:r>
-        <w:rPr>
-          <w:color w:val="212121"/>
-        </w:rPr>
-        <w:t>relative</w:t>
+        <w:t/>
+      </w:r>
+      <w:r>
+        <w:rPr>
+          <w:color w:val="212121"/>
+        </w:rPr>
+        <w:t/>
       </w:r>
       <w:r>
         <w:rPr>
           <w:color w:val="212121"/>
           <w:spacing w:val="-10"/>
         </w:rPr>
-        <w:t> </w:t>
-      </w:r>
-      <w:r>
-        <w:rPr>
-          <w:color w:val="212121"/>
-        </w:rPr>
-        <w:t>to</w:t>
+        <w:t/>
+      </w:r>
+      <w:r>
+        <w:rPr>
+          <w:color w:val="212121"/>
+        </w:rPr>
+        <w:t/>
       </w:r>
       <w:r>
         <w:rPr>
           <w:color w:val="212121"/>
           <w:spacing w:val="-12"/>
         </w:rPr>
-        <w:t> </w:t>
-      </w:r>
-      <w:r>
-        <w:rPr>
-          <w:color w:val="212121"/>
-        </w:rPr>
-        <w:t>the</w:t>
+        <w:t/>
+      </w:r>
+      <w:r>
+        <w:rPr>
+          <w:color w:val="212121"/>
+        </w:rPr>
+        <w:t/>
       </w:r>
       <w:r>
         <w:rPr>
           <w:color w:val="212121"/>
           <w:spacing w:val="-10"/>
         </w:rPr>
-        <w:t> </w:t>
-      </w:r>
-      <w:r>
-        <w:rPr>
-          <w:color w:val="212121"/>
-        </w:rPr>
-        <w:t>series'</w:t>
+        <w:t/>
+      </w:r>
+      <w:r>
+        <w:rPr>
+          <w:color w:val="212121"/>
+        </w:rPr>
+        <w:t/>
       </w:r>
       <w:r>
         <w:rPr>
           <w:color w:val="212121"/>
           <w:spacing w:val="-10"/>
         </w:rPr>
-        <w:t> </w:t>
-      </w:r>
-      <w:r>
-        <w:rPr>
-          <w:color w:val="212121"/>
-        </w:rPr>
-        <w:t>mean</w:t>
+        <w:t/>
+      </w:r>
+      <w:r>
+        <w:rPr>
+          <w:color w:val="212121"/>
+        </w:rPr>
+        <w:t/>
       </w:r>
       <w:r>
         <w:rPr>
           <w:color w:val="212121"/>
           <w:spacing w:val="-11"/>
         </w:rPr>
-        <w:t> </w:t>
-      </w:r>
-      <w:r>
-        <w:rPr>
-          <w:color w:val="212121"/>
-        </w:rPr>
-        <w:t>regardless</w:t>
+        <w:t/>
+      </w:r>
+      <w:r>
+        <w:rPr>
+          <w:color w:val="212121"/>
+        </w:rPr>
+        <w:t/>
       </w:r>
       <w:r>
         <w:rPr>
           <w:color w:val="212121"/>
           <w:spacing w:val="-12"/>
         </w:rPr>
-        <w:t> </w:t>
-      </w:r>
-      <w:r>
-        <w:rPr>
-          <w:color w:val="212121"/>
-        </w:rPr>
-        <w:t>of</w:t>
+        <w:t/>
+      </w:r>
+      <w:r>
+        <w:rPr>
+          <w:color w:val="212121"/>
+        </w:rPr>
+        <w:t/>
       </w:r>
       <w:r>
         <w:rPr>
           <w:color w:val="212121"/>
           <w:spacing w:val="-7"/>
         </w:rPr>
-        <w:t> </w:t>
-      </w:r>
-      <w:r>
-        <w:rPr>
-          <w:color w:val="212121"/>
-        </w:rPr>
-        <w:t>ε,</w:t>
+        <w:t/>
+      </w:r>
+      <w:r>
+        <w:rPr>
+          <w:color w:val="212121"/>
+        </w:rPr>
+        <w:t/>
       </w:r>
       <w:r>
         <w:rPr>
           <w:color w:val="212121"/>
           <w:spacing w:val="-11"/>
         </w:rPr>
-        <w:t> </w:t>
-      </w:r>
-      <w:r>
-        <w:rPr>
-          <w:color w:val="212121"/>
-        </w:rPr>
-        <w:t>this</w:t>
+        <w:t/>
+      </w:r>
+      <w:r>
+        <w:rPr>
+          <w:color w:val="212121"/>
+        </w:rPr>
+        <w:t/>
       </w:r>
       <w:r>
         <w:rPr>
           <w:color w:val="212121"/>
           <w:spacing w:val="-9"/>
         </w:rPr>
-        <w:t> </w:t>
-      </w:r>
-      <w:r>
-        <w:rPr>
-          <w:color w:val="212121"/>
-        </w:rPr>
-        <w:t>single-point measurement is a useful first indication of the privacy-utility trade-off rather than a complete curve; mapping accuracy loss across a wider range of ε values (for example 0.1 to 5) would show more precisely where the cost becomes acceptable for a given operational use case.</w:t>
+        <w:t/>
+      </w:r>
+      <w:r>
+        <w:rPr>
+          <w:color w:val="212121"/>
+        </w:rPr>
+        <w:t/>
       </w:r>
     </w:p>
     <w:p>
@@ -32874,7 +32916,7 @@
         <w:rPr>
           <w:color w:val="212121"/>
         </w:rPr>
-        <w:t>This project addressed the challenge of analysing and forecasting Libya's electricity crisis in the complete absence of public, granular national consumption data. GridVeil combines real public statistics documenting Libya's generation, distribution and reliability problems with a Hybrid CNN-LSTM-Attention forecasting and anomaly-detection pipeline built and validated on a public, climatically comparable proxy dataset from Tetouan, Morocco, and a differential-privacy experiment quantifying the accuracy cost of formally protecting consumption data. All results are integrated into a single, self-contained dashboard.</w:t>
+        <w:t>This project addressed the challenge of analysing and forecasting Libya's electricity crisis in the complete absence of public, granular national consumption data. GridVeil combines real public statistics documenting Libya's generation, distribution and reliability problems with a Hybrid CNN-LSTM-Attention forecasting and anomaly-detection pipeline built and validated on a public, climatically comparable proxy dataset from Tetouan, Morocco, and a label-perturbation experiment documented with its reproducibility limits. Results are documented in the report and reproducibility scripts.</w:t>
       </w:r>
     </w:p>
     <w:p>
@@ -32918,898 +32960,898 @@
         <w:rPr>
           <w:color w:val="212121"/>
         </w:rPr>
-        <w:t>The Hybrid CNN-LSTM-Attention model achieved a test MAPE of 2.69%, substantially outperforming a Random</w:t>
+        <w:t>The Hybrid CNN-LSTM-Attention model reports a test MAPE of 2.42%. The Random Forest baseline script is included, but its result is not verified until it is run on the same chronological split.</w:t>
       </w:r>
       <w:r>
         <w:rPr>
           <w:color w:val="212121"/>
           <w:spacing w:val="-1"/>
         </w:rPr>
-        <w:t> </w:t>
-      </w:r>
-      <w:r>
-        <w:rPr>
-          <w:color w:val="212121"/>
-        </w:rPr>
-        <w:t>Forest</w:t>
+        <w:t/>
+      </w:r>
+      <w:r>
+        <w:rPr>
+          <w:color w:val="212121"/>
+        </w:rPr>
+        <w:t/>
       </w:r>
       <w:r>
         <w:rPr>
           <w:color w:val="212121"/>
           <w:spacing w:val="-1"/>
         </w:rPr>
-        <w:t> </w:t>
-      </w:r>
-      <w:r>
-        <w:rPr>
-          <w:color w:val="212121"/>
-        </w:rPr>
-        <w:t>baseline</w:t>
+        <w:t/>
+      </w:r>
+      <w:r>
+        <w:rPr>
+          <w:color w:val="212121"/>
+        </w:rPr>
+        <w:t/>
       </w:r>
       <w:r>
         <w:rPr>
           <w:color w:val="212121"/>
           <w:spacing w:val="-2"/>
         </w:rPr>
-        <w:t> </w:t>
-      </w:r>
-      <w:r>
-        <w:rPr>
-          <w:color w:val="212121"/>
-        </w:rPr>
-        <w:t>at</w:t>
+        <w:t/>
+      </w:r>
+      <w:r>
+        <w:rPr>
+          <w:color w:val="212121"/>
+        </w:rPr>
+        <w:t/>
       </w:r>
       <w:r>
         <w:rPr>
           <w:color w:val="212121"/>
           <w:spacing w:val="-1"/>
         </w:rPr>
-        <w:t> </w:t>
-      </w:r>
-      <w:r>
-        <w:rPr>
-          <w:color w:val="212121"/>
-        </w:rPr>
-        <w:t>5.77% MAPE on</w:t>
+        <w:t/>
+      </w:r>
+      <w:r>
+        <w:rPr>
+          <w:color w:val="212121"/>
+        </w:rPr>
+        <w:t/>
       </w:r>
       <w:r>
         <w:rPr>
           <w:color w:val="212121"/>
           <w:spacing w:val="-3"/>
         </w:rPr>
-        <w:t> </w:t>
-      </w:r>
-      <w:r>
-        <w:rPr>
-          <w:color w:val="212121"/>
-        </w:rPr>
-        <w:t>an</w:t>
+        <w:t/>
+      </w:r>
+      <w:r>
+        <w:rPr>
+          <w:color w:val="212121"/>
+        </w:rPr>
+        <w:t/>
       </w:r>
       <w:r>
         <w:rPr>
           <w:color w:val="212121"/>
           <w:spacing w:val="-3"/>
         </w:rPr>
-        <w:t> </w:t>
-      </w:r>
-      <w:r>
-        <w:rPr>
-          <w:color w:val="212121"/>
-        </w:rPr>
-        <w:t>identical chronological split, demonstrating</w:t>
+        <w:t/>
+      </w:r>
+      <w:r>
+        <w:rPr>
+          <w:color w:val="212121"/>
+        </w:rPr>
+        <w:t/>
       </w:r>
       <w:r>
         <w:rPr>
           <w:color w:val="212121"/>
           <w:spacing w:val="-3"/>
         </w:rPr>
-        <w:t> </w:t>
-      </w:r>
-      <w:r>
-        <w:rPr>
-          <w:color w:val="212121"/>
-        </w:rPr>
-        <w:t>that combining convolutional, recurrent and attention mechanisms yields tangible accuracy gains for short-horizon electricity load</w:t>
+        <w:t/>
+      </w:r>
+      <w:r>
+        <w:rPr>
+          <w:color w:val="212121"/>
+        </w:rPr>
+        <w:t/>
       </w:r>
       <w:r>
         <w:rPr>
           <w:color w:val="212121"/>
           <w:spacing w:val="-1"/>
         </w:rPr>
-        <w:t> </w:t>
-      </w:r>
-      <w:r>
-        <w:rPr>
-          <w:color w:val="212121"/>
-        </w:rPr>
-        <w:t>forecasting.</w:t>
+        <w:t/>
+      </w:r>
+      <w:r>
+        <w:rPr>
+          <w:color w:val="212121"/>
+        </w:rPr>
+        <w:t/>
       </w:r>
       <w:r>
         <w:rPr>
           <w:color w:val="212121"/>
           <w:spacing w:val="-2"/>
         </w:rPr>
-        <w:t> </w:t>
-      </w:r>
-      <w:r>
-        <w:rPr>
-          <w:color w:val="212121"/>
-        </w:rPr>
-        <w:t>The data-driven</w:t>
+        <w:t/>
+      </w:r>
+      <w:r>
+        <w:rPr>
+          <w:color w:val="212121"/>
+        </w:rPr>
+        <w:t/>
       </w:r>
       <w:r>
         <w:rPr>
           <w:color w:val="212121"/>
           <w:spacing w:val="-2"/>
         </w:rPr>
-        <w:t> </w:t>
-      </w:r>
-      <w:r>
-        <w:rPr>
-          <w:color w:val="212121"/>
-        </w:rPr>
-        <w:t>anomaly-detection layer, using</w:t>
+        <w:t/>
+      </w:r>
+      <w:r>
+        <w:rPr>
+          <w:color w:val="212121"/>
+        </w:rPr>
+        <w:t/>
       </w:r>
       <w:r>
         <w:rPr>
           <w:color w:val="212121"/>
           <w:spacing w:val="-1"/>
         </w:rPr>
-        <w:t> </w:t>
-      </w:r>
-      <w:r>
-        <w:rPr>
-          <w:color w:val="212121"/>
-        </w:rPr>
-        <w:t>an</w:t>
+        <w:t/>
+      </w:r>
+      <w:r>
+        <w:rPr>
+          <w:color w:val="212121"/>
+        </w:rPr>
+        <w:t/>
       </w:r>
       <w:r>
         <w:rPr>
           <w:color w:val="212121"/>
           <w:spacing w:val="-1"/>
         </w:rPr>
-        <w:t> </w:t>
-      </w:r>
-      <w:r>
-        <w:rPr>
-          <w:color w:val="212121"/>
-        </w:rPr>
-        <w:t>adaptive</w:t>
+        <w:t/>
+      </w:r>
+      <w:r>
+        <w:rPr>
+          <w:color w:val="212121"/>
+        </w:rPr>
+        <w:t/>
       </w:r>
       <w:r>
         <w:rPr>
           <w:color w:val="212121"/>
           <w:spacing w:val="-2"/>
         </w:rPr>
-        <w:t> </w:t>
-      </w:r>
-      <w:r>
-        <w:rPr>
-          <w:color w:val="212121"/>
-        </w:rPr>
-        <w:t>threshold</w:t>
+        <w:t/>
+      </w:r>
+      <w:r>
+        <w:rPr>
+          <w:color w:val="212121"/>
+        </w:rPr>
+        <w:t/>
       </w:r>
       <w:r>
         <w:rPr>
           <w:color w:val="212121"/>
           <w:spacing w:val="-1"/>
         </w:rPr>
-        <w:t> </w:t>
-      </w:r>
-      <w:r>
-        <w:rPr>
-          <w:color w:val="212121"/>
-        </w:rPr>
-        <w:t>derived from</w:t>
+        <w:t/>
+      </w:r>
+      <w:r>
+        <w:rPr>
+          <w:color w:val="212121"/>
+        </w:rPr>
+        <w:t/>
       </w:r>
       <w:r>
         <w:rPr>
           <w:color w:val="212121"/>
           <w:spacing w:val="-4"/>
         </w:rPr>
-        <w:t> </w:t>
-      </w:r>
-      <w:r>
-        <w:rPr>
-          <w:color w:val="212121"/>
-        </w:rPr>
-        <w:t>the</w:t>
+        <w:t/>
+      </w:r>
+      <w:r>
+        <w:rPr>
+          <w:color w:val="212121"/>
+        </w:rPr>
+        <w:t/>
       </w:r>
       <w:r>
         <w:rPr>
           <w:color w:val="212121"/>
           <w:spacing w:val="-1"/>
         </w:rPr>
-        <w:t> </w:t>
-      </w:r>
-      <w:r>
-        <w:rPr>
-          <w:color w:val="212121"/>
-        </w:rPr>
-        <w:t>model's</w:t>
+        <w:t/>
+      </w:r>
+      <w:r>
+        <w:rPr>
+          <w:color w:val="212121"/>
+        </w:rPr>
+        <w:t/>
       </w:r>
       <w:r>
         <w:rPr>
           <w:color w:val="212121"/>
           <w:spacing w:val="-2"/>
         </w:rPr>
-        <w:t> </w:t>
-      </w:r>
-      <w:r>
-        <w:rPr>
-          <w:color w:val="212121"/>
-        </w:rPr>
-        <w:t>own</w:t>
+        <w:t/>
+      </w:r>
+      <w:r>
+        <w:rPr>
+          <w:color w:val="212121"/>
+        </w:rPr>
+        <w:t/>
       </w:r>
       <w:r>
         <w:rPr>
           <w:color w:val="212121"/>
           <w:spacing w:val="-2"/>
         </w:rPr>
-        <w:t> </w:t>
-      </w:r>
-      <w:r>
-        <w:rPr>
-          <w:color w:val="212121"/>
-        </w:rPr>
-        <w:t>training</w:t>
+        <w:t/>
+      </w:r>
+      <w:r>
+        <w:rPr>
+          <w:color w:val="212121"/>
+        </w:rPr>
+        <w:t/>
       </w:r>
       <w:r>
         <w:rPr>
           <w:color w:val="212121"/>
           <w:spacing w:val="-3"/>
         </w:rPr>
-        <w:t> </w:t>
-      </w:r>
-      <w:r>
-        <w:rPr>
-          <w:color w:val="212121"/>
-        </w:rPr>
-        <w:t>error,</w:t>
+        <w:t/>
+      </w:r>
+      <w:r>
+        <w:rPr>
+          <w:color w:val="212121"/>
+        </w:rPr>
+        <w:t/>
       </w:r>
       <w:r>
         <w:rPr>
           <w:color w:val="212121"/>
           <w:spacing w:val="-1"/>
         </w:rPr>
-        <w:t> </w:t>
-      </w:r>
-      <w:r>
-        <w:rPr>
-          <w:color w:val="212121"/>
-        </w:rPr>
-        <w:t>flagged</w:t>
+        <w:t/>
+      </w:r>
+      <w:r>
+        <w:rPr>
+          <w:color w:val="212121"/>
+        </w:rPr>
+        <w:t/>
       </w:r>
       <w:r>
         <w:rPr>
           <w:color w:val="212121"/>
           <w:spacing w:val="-3"/>
         </w:rPr>
-        <w:t> </w:t>
-      </w:r>
-      <w:r>
-        <w:rPr>
-          <w:color w:val="212121"/>
-        </w:rPr>
-        <w:t>7,834</w:t>
+        <w:t/>
+      </w:r>
+      <w:r>
+        <w:rPr>
+          <w:color w:val="212121"/>
+        </w:rPr>
+        <w:t/>
       </w:r>
       <w:r>
         <w:rPr>
           <w:color w:val="212121"/>
           <w:spacing w:val="-1"/>
         </w:rPr>
-        <w:t> </w:t>
-      </w:r>
-      <w:r>
-        <w:rPr>
-          <w:color w:val="212121"/>
-        </w:rPr>
-        <w:t>anomalous</w:t>
+        <w:t/>
+      </w:r>
+      <w:r>
+        <w:rPr>
+          <w:color w:val="212121"/>
+        </w:rPr>
+        <w:t/>
       </w:r>
       <w:r>
         <w:rPr>
           <w:color w:val="212121"/>
           <w:spacing w:val="-3"/>
         </w:rPr>
-        <w:t> </w:t>
-      </w:r>
-      <w:r>
-        <w:rPr>
-          <w:color w:val="212121"/>
-        </w:rPr>
-        <w:t>observations</w:t>
+        <w:t/>
+      </w:r>
+      <w:r>
+        <w:rPr>
+          <w:color w:val="212121"/>
+        </w:rPr>
+        <w:t/>
       </w:r>
       <w:r>
         <w:rPr>
           <w:color w:val="212121"/>
           <w:spacing w:val="-3"/>
         </w:rPr>
-        <w:t> </w:t>
-      </w:r>
-      <w:r>
-        <w:rPr>
-          <w:color w:val="212121"/>
-        </w:rPr>
-        <w:t>in</w:t>
+        <w:t/>
+      </w:r>
+      <w:r>
+        <w:rPr>
+          <w:color w:val="212121"/>
+        </w:rPr>
+        <w:t/>
       </w:r>
       <w:r>
         <w:rPr>
           <w:color w:val="212121"/>
           <w:spacing w:val="-2"/>
         </w:rPr>
-        <w:t> </w:t>
-      </w:r>
-      <w:r>
-        <w:rPr>
-          <w:color w:val="212121"/>
-        </w:rPr>
-        <w:t>the</w:t>
+        <w:t/>
+      </w:r>
+      <w:r>
+        <w:rPr>
+          <w:color w:val="212121"/>
+        </w:rPr>
+        <w:t/>
       </w:r>
       <w:r>
         <w:rPr>
           <w:color w:val="212121"/>
           <w:spacing w:val="-1"/>
         </w:rPr>
-        <w:t> </w:t>
-      </w:r>
-      <w:r>
-        <w:rPr>
-          <w:color w:val="212121"/>
-        </w:rPr>
-        <w:t>test</w:t>
+        <w:t/>
+      </w:r>
+      <w:r>
+        <w:rPr>
+          <w:color w:val="212121"/>
+        </w:rPr>
+        <w:t/>
       </w:r>
       <w:r>
         <w:rPr>
           <w:color w:val="212121"/>
           <w:spacing w:val="-1"/>
         </w:rPr>
-        <w:t> </w:t>
-      </w:r>
-      <w:r>
-        <w:rPr>
-          <w:color w:val="212121"/>
-        </w:rPr>
-        <w:t>set without relying on arbitrary fixed cutoffs. The differential-privacy experiment showed that a meaningful, quantifiable privacy</w:t>
+        <w:t/>
+      </w:r>
+      <w:r>
+        <w:rPr>
+          <w:color w:val="212121"/>
+        </w:rPr>
+        <w:t/>
       </w:r>
       <w:r>
         <w:rPr>
           <w:color w:val="212121"/>
           <w:spacing w:val="-1"/>
         </w:rPr>
-        <w:t> </w:t>
-      </w:r>
-      <w:r>
-        <w:rPr>
-          <w:color w:val="212121"/>
-        </w:rPr>
-        <w:t>guarantee</w:t>
+        <w:t/>
+      </w:r>
+      <w:r>
+        <w:rPr>
+          <w:color w:val="212121"/>
+        </w:rPr>
+        <w:t/>
       </w:r>
       <w:r>
         <w:rPr>
           <w:color w:val="212121"/>
           <w:spacing w:val="-1"/>
         </w:rPr>
-        <w:t> </w:t>
-      </w:r>
-      <w:r>
-        <w:rPr>
-          <w:color w:val="212121"/>
-        </w:rPr>
-        <w:t>(ε</w:t>
+        <w:t/>
+      </w:r>
+      <w:r>
+        <w:rPr>
+          <w:color w:val="212121"/>
+        </w:rPr>
+        <w:t/>
       </w:r>
       <w:r>
         <w:rPr>
           <w:color w:val="212121"/>
           <w:spacing w:val="-4"/>
         </w:rPr>
-        <w:t> </w:t>
-      </w:r>
-      <w:r>
-        <w:rPr>
-          <w:color w:val="212121"/>
-        </w:rPr>
-        <w:t>=</w:t>
+        <w:t/>
+      </w:r>
+      <w:r>
+        <w:rPr>
+          <w:color w:val="212121"/>
+        </w:rPr>
+        <w:t/>
       </w:r>
       <w:r>
         <w:rPr>
           <w:color w:val="212121"/>
           <w:spacing w:val="-1"/>
         </w:rPr>
-        <w:t> </w:t>
-      </w:r>
-      <w:r>
-        <w:rPr>
-          <w:color w:val="212121"/>
-        </w:rPr>
-        <w:t>1.0)</w:t>
+        <w:t/>
+      </w:r>
+      <w:r>
+        <w:rPr>
+          <w:color w:val="212121"/>
+        </w:rPr>
+        <w:t/>
       </w:r>
       <w:r>
         <w:rPr>
           <w:color w:val="212121"/>
           <w:spacing w:val="-1"/>
         </w:rPr>
-        <w:t> </w:t>
-      </w:r>
-      <w:r>
-        <w:rPr>
-          <w:color w:val="212121"/>
-        </w:rPr>
-        <w:t>comes</w:t>
+        <w:t/>
+      </w:r>
+      <w:r>
+        <w:rPr>
+          <w:color w:val="212121"/>
+        </w:rPr>
+        <w:t/>
       </w:r>
       <w:r>
         <w:rPr>
           <w:color w:val="212121"/>
           <w:spacing w:val="-1"/>
         </w:rPr>
-        <w:t> </w:t>
-      </w:r>
-      <w:r>
-        <w:rPr>
-          <w:color w:val="212121"/>
-        </w:rPr>
-        <w:t>at a</w:t>
+        <w:t/>
+      </w:r>
+      <w:r>
+        <w:rPr>
+          <w:color w:val="212121"/>
+        </w:rPr>
+        <w:t/>
       </w:r>
       <w:r>
         <w:rPr>
           <w:color w:val="212121"/>
           <w:spacing w:val="-4"/>
         </w:rPr>
-        <w:t> </w:t>
-      </w:r>
-      <w:r>
-        <w:rPr>
-          <w:color w:val="212121"/>
-        </w:rPr>
-        <w:t>real</w:t>
+        <w:t/>
+      </w:r>
+      <w:r>
+        <w:rPr>
+          <w:color w:val="212121"/>
+        </w:rPr>
+        <w:t/>
       </w:r>
       <w:r>
         <w:rPr>
           <w:color w:val="212121"/>
           <w:spacing w:val="-1"/>
         </w:rPr>
-        <w:t> </w:t>
-      </w:r>
-      <w:r>
-        <w:rPr>
-          <w:color w:val="212121"/>
-        </w:rPr>
-        <w:t>but bounded</w:t>
+        <w:t/>
+      </w:r>
+      <w:r>
+        <w:rPr>
+          <w:color w:val="212121"/>
+        </w:rPr>
+        <w:t/>
       </w:r>
       <w:r>
         <w:rPr>
           <w:color w:val="212121"/>
           <w:spacing w:val="-4"/>
         </w:rPr>
-        <w:t> </w:t>
-      </w:r>
-      <w:r>
-        <w:rPr>
-          <w:color w:val="212121"/>
-        </w:rPr>
-        <w:t>accuracy</w:t>
+        <w:t/>
+      </w:r>
+      <w:r>
+        <w:rPr>
+          <w:color w:val="212121"/>
+        </w:rPr>
+        <w:t/>
       </w:r>
       <w:r>
         <w:rPr>
           <w:color w:val="212121"/>
           <w:spacing w:val="-1"/>
         </w:rPr>
-        <w:t> </w:t>
-      </w:r>
-      <w:r>
-        <w:rPr>
-          <w:color w:val="212121"/>
-        </w:rPr>
-        <w:t>cost –</w:t>
+        <w:t/>
+      </w:r>
+      <w:r>
+        <w:rPr>
+          <w:color w:val="212121"/>
+        </w:rPr>
+        <w:t/>
       </w:r>
       <w:r>
         <w:rPr>
           <w:color w:val="212121"/>
           <w:spacing w:val="-1"/>
         </w:rPr>
-        <w:t> </w:t>
-      </w:r>
-      <w:r>
-        <w:rPr>
-          <w:color w:val="212121"/>
-        </w:rPr>
-        <w:t>a</w:t>
+        <w:t/>
+      </w:r>
+      <w:r>
+        <w:rPr>
+          <w:color w:val="212121"/>
+        </w:rPr>
+        <w:t/>
       </w:r>
       <w:r>
         <w:rPr>
           <w:color w:val="212121"/>
           <w:spacing w:val="-4"/>
         </w:rPr>
-        <w:t> </w:t>
-      </w:r>
-      <w:r>
-        <w:rPr>
-          <w:color w:val="212121"/>
-        </w:rPr>
-        <w:t>roughly</w:t>
+        <w:t/>
+      </w:r>
+      <w:r>
+        <w:rPr>
+          <w:color w:val="212121"/>
+        </w:rPr>
+        <w:t/>
       </w:r>
       <w:r>
         <w:rPr>
           <w:color w:val="212121"/>
           <w:spacing w:val="-1"/>
         </w:rPr>
-        <w:t> </w:t>
-      </w:r>
-      <w:r>
-        <w:rPr>
-          <w:color w:val="212121"/>
-        </w:rPr>
-        <w:t>30%</w:t>
+        <w:t/>
+      </w:r>
+      <w:r>
+        <w:rPr>
+          <w:color w:val="212121"/>
+        </w:rPr>
+        <w:t/>
       </w:r>
       <w:r>
         <w:rPr>
           <w:color w:val="212121"/>
           <w:spacing w:val="-1"/>
         </w:rPr>
-        <w:t> </w:t>
-      </w:r>
-      <w:r>
-        <w:rPr>
-          <w:color w:val="212121"/>
-        </w:rPr>
-        <w:t>relative increase</w:t>
+        <w:t/>
+      </w:r>
+      <w:r>
+        <w:rPr>
+          <w:color w:val="212121"/>
+        </w:rPr>
+        <w:t/>
       </w:r>
       <w:r>
         <w:rPr>
           <w:color w:val="212121"/>
           <w:spacing w:val="-1"/>
         </w:rPr>
-        <w:t> </w:t>
-      </w:r>
-      <w:r>
-        <w:rPr>
-          <w:color w:val="212121"/>
-        </w:rPr>
-        <w:t>in forecasting</w:t>
+        <w:t/>
+      </w:r>
+      <w:r>
+        <w:rPr>
+          <w:color w:val="212121"/>
+        </w:rPr>
+        <w:t/>
       </w:r>
       <w:r>
         <w:rPr>
           <w:color w:val="212121"/>
           <w:spacing w:val="-10"/>
         </w:rPr>
-        <w:t> </w:t>
-      </w:r>
-      <w:r>
-        <w:rPr>
-          <w:color w:val="212121"/>
-        </w:rPr>
-        <w:t>error</w:t>
+        <w:t/>
+      </w:r>
+      <w:r>
+        <w:rPr>
+          <w:color w:val="212121"/>
+        </w:rPr>
+        <w:t/>
       </w:r>
       <w:r>
         <w:rPr>
           <w:color w:val="212121"/>
           <w:spacing w:val="-8"/>
         </w:rPr>
-        <w:t> </w:t>
-      </w:r>
-      <w:r>
-        <w:rPr>
-          <w:color w:val="212121"/>
-        </w:rPr>
-        <w:t>–</w:t>
+        <w:t/>
+      </w:r>
+      <w:r>
+        <w:rPr>
+          <w:color w:val="212121"/>
+        </w:rPr>
+        <w:t/>
       </w:r>
       <w:r>
         <w:rPr>
           <w:color w:val="212121"/>
           <w:spacing w:val="-9"/>
         </w:rPr>
-        <w:t> </w:t>
-      </w:r>
-      <w:r>
-        <w:rPr>
-          <w:color w:val="212121"/>
-        </w:rPr>
-        <w:t>giving</w:t>
+        <w:t/>
+      </w:r>
+      <w:r>
+        <w:rPr>
+          <w:color w:val="212121"/>
+        </w:rPr>
+        <w:t/>
       </w:r>
       <w:r>
         <w:rPr>
           <w:color w:val="212121"/>
           <w:spacing w:val="-11"/>
         </w:rPr>
-        <w:t> </w:t>
-      </w:r>
-      <w:r>
-        <w:rPr>
-          <w:color w:val="212121"/>
-        </w:rPr>
-        <w:t>project</w:t>
+        <w:t/>
+      </w:r>
+      <w:r>
+        <w:rPr>
+          <w:color w:val="212121"/>
+        </w:rPr>
+        <w:t/>
       </w:r>
       <w:r>
         <w:rPr>
           <w:color w:val="212121"/>
           <w:spacing w:val="-8"/>
         </w:rPr>
-        <w:t> </w:t>
-      </w:r>
-      <w:r>
-        <w:rPr>
-          <w:color w:val="212121"/>
-        </w:rPr>
-        <w:t>stakeholders</w:t>
+        <w:t/>
+      </w:r>
+      <w:r>
+        <w:rPr>
+          <w:color w:val="212121"/>
+        </w:rPr>
+        <w:t/>
       </w:r>
       <w:r>
         <w:rPr>
           <w:color w:val="212121"/>
           <w:spacing w:val="-10"/>
         </w:rPr>
-        <w:t> </w:t>
-      </w:r>
-      <w:r>
-        <w:rPr>
-          <w:color w:val="212121"/>
-        </w:rPr>
-        <w:t>a</w:t>
+        <w:t/>
+      </w:r>
+      <w:r>
+        <w:rPr>
+          <w:color w:val="212121"/>
+        </w:rPr>
+        <w:t/>
       </w:r>
       <w:r>
         <w:rPr>
           <w:color w:val="212121"/>
           <w:spacing w:val="-10"/>
         </w:rPr>
-        <w:t> </w:t>
-      </w:r>
-      <w:r>
-        <w:rPr>
-          <w:color w:val="212121"/>
-        </w:rPr>
-        <w:t>concrete,</w:t>
+        <w:t/>
+      </w:r>
+      <w:r>
+        <w:rPr>
+          <w:color w:val="212121"/>
+        </w:rPr>
+        <w:t/>
       </w:r>
       <w:r>
         <w:rPr>
           <w:color w:val="212121"/>
           <w:spacing w:val="-11"/>
         </w:rPr>
-        <w:t> </w:t>
-      </w:r>
-      <w:r>
-        <w:rPr>
-          <w:color w:val="212121"/>
-        </w:rPr>
-        <w:t>evidence-based</w:t>
+        <w:t/>
+      </w:r>
+      <w:r>
+        <w:rPr>
+          <w:color w:val="212121"/>
+        </w:rPr>
+        <w:t/>
       </w:r>
       <w:r>
         <w:rPr>
           <w:color w:val="212121"/>
           <w:spacing w:val="-9"/>
         </w:rPr>
-        <w:t> </w:t>
-      </w:r>
-      <w:r>
-        <w:rPr>
-          <w:color w:val="212121"/>
-        </w:rPr>
-        <w:t>starting</w:t>
+        <w:t/>
+      </w:r>
+      <w:r>
+        <w:rPr>
+          <w:color w:val="212121"/>
+        </w:rPr>
+        <w:t/>
       </w:r>
       <w:r>
         <w:rPr>
           <w:color w:val="212121"/>
           <w:spacing w:val="-10"/>
         </w:rPr>
-        <w:t> </w:t>
-      </w:r>
-      <w:r>
-        <w:rPr>
-          <w:color w:val="212121"/>
-        </w:rPr>
-        <w:t>point</w:t>
+        <w:t/>
+      </w:r>
+      <w:r>
+        <w:rPr>
+          <w:color w:val="212121"/>
+        </w:rPr>
+        <w:t/>
       </w:r>
       <w:r>
         <w:rPr>
           <w:color w:val="212121"/>
           <w:spacing w:val="-8"/>
         </w:rPr>
-        <w:t> </w:t>
-      </w:r>
-      <w:r>
-        <w:rPr>
-          <w:color w:val="212121"/>
-        </w:rPr>
-        <w:t>for</w:t>
+        <w:t/>
+      </w:r>
+      <w:r>
+        <w:rPr>
+          <w:color w:val="212121"/>
+        </w:rPr>
+        <w:t/>
       </w:r>
       <w:r>
         <w:rPr>
           <w:color w:val="212121"/>
           <w:spacing w:val="-11"/>
         </w:rPr>
-        <w:t> </w:t>
-      </w:r>
-      <w:r>
-        <w:rPr>
-          <w:color w:val="212121"/>
-        </w:rPr>
-        <w:t>future</w:t>
+        <w:t/>
+      </w:r>
+      <w:r>
+        <w:rPr>
+          <w:color w:val="212121"/>
+        </w:rPr>
+        <w:t/>
       </w:r>
       <w:r>
         <w:rPr>
           <w:color w:val="212121"/>
           <w:spacing w:val="-9"/>
         </w:rPr>
-        <w:t> </w:t>
-      </w:r>
-      <w:r>
-        <w:rPr>
-          <w:color w:val="212121"/>
-        </w:rPr>
-        <w:t>privacy-budget decisions. Taken together, these results demonstrate that a scientifically credible, ethically grounded</w:t>
+        <w:t/>
+      </w:r>
+      <w:r>
+        <w:rPr>
+          <w:color w:val="212121"/>
+        </w:rPr>
+        <w:t/>
       </w:r>
       <w:r>
         <w:rPr>
           <w:color w:val="212121"/>
           <w:spacing w:val="-1"/>
         </w:rPr>
-        <w:t> </w:t>
-      </w:r>
-      <w:r>
-        <w:rPr>
-          <w:color w:val="212121"/>
-        </w:rPr>
-        <w:t>and</w:t>
+        <w:t/>
+      </w:r>
+      <w:r>
+        <w:rPr>
+          <w:color w:val="212121"/>
+        </w:rPr>
+        <w:t/>
       </w:r>
       <w:r>
         <w:rPr>
           <w:color w:val="212121"/>
           <w:spacing w:val="-2"/>
         </w:rPr>
-        <w:t> </w:t>
-      </w:r>
-      <w:r>
-        <w:rPr>
-          <w:color w:val="212121"/>
-        </w:rPr>
-        <w:t>privacy-safe</w:t>
+        <w:t/>
+      </w:r>
+      <w:r>
+        <w:rPr>
+          <w:color w:val="212121"/>
+        </w:rPr>
+        <w:t/>
       </w:r>
       <w:r>
         <w:rPr>
           <w:color w:val="212121"/>
           <w:spacing w:val="-1"/>
         </w:rPr>
-        <w:t> </w:t>
-      </w:r>
-      <w:r>
-        <w:rPr>
-          <w:color w:val="212121"/>
-        </w:rPr>
-        <w:t>forecasting</w:t>
+        <w:t/>
+      </w:r>
+      <w:r>
+        <w:rPr>
+          <w:color w:val="212121"/>
+        </w:rPr>
+        <w:t/>
       </w:r>
       <w:r>
         <w:rPr>
           <w:color w:val="212121"/>
           <w:spacing w:val="-2"/>
         </w:rPr>
-        <w:t> </w:t>
-      </w:r>
-      <w:r>
-        <w:rPr>
-          <w:color w:val="212121"/>
-        </w:rPr>
-        <w:t>methodology</w:t>
+        <w:t/>
+      </w:r>
+      <w:r>
+        <w:rPr>
+          <w:color w:val="212121"/>
+        </w:rPr>
+        <w:t/>
       </w:r>
       <w:r>
         <w:rPr>
           <w:color w:val="212121"/>
           <w:spacing w:val="-1"/>
         </w:rPr>
-        <w:t> </w:t>
-      </w:r>
-      <w:r>
-        <w:rPr>
-          <w:color w:val="212121"/>
-        </w:rPr>
-        <w:t>can</w:t>
+        <w:t/>
+      </w:r>
+      <w:r>
+        <w:rPr>
+          <w:color w:val="212121"/>
+        </w:rPr>
+        <w:t/>
       </w:r>
       <w:r>
         <w:rPr>
           <w:color w:val="212121"/>
           <w:spacing w:val="-4"/>
         </w:rPr>
-        <w:t> </w:t>
-      </w:r>
-      <w:r>
-        <w:rPr>
-          <w:color w:val="212121"/>
-        </w:rPr>
-        <w:t>be</w:t>
+        <w:t/>
+      </w:r>
+      <w:r>
+        <w:rPr>
+          <w:color w:val="212121"/>
+        </w:rPr>
+        <w:t/>
       </w:r>
       <w:r>
         <w:rPr>
           <w:color w:val="212121"/>
           <w:spacing w:val="-1"/>
         </w:rPr>
-        <w:t> </w:t>
-      </w:r>
-      <w:r>
-        <w:rPr>
-          <w:color w:val="212121"/>
-        </w:rPr>
-        <w:t>built</w:t>
+        <w:t/>
+      </w:r>
+      <w:r>
+        <w:rPr>
+          <w:color w:val="212121"/>
+        </w:rPr>
+        <w:t/>
       </w:r>
       <w:r>
         <w:rPr>
           <w:color w:val="212121"/>
           <w:spacing w:val="-1"/>
         </w:rPr>
-        <w:t> </w:t>
-      </w:r>
-      <w:r>
-        <w:rPr>
-          <w:color w:val="212121"/>
-        </w:rPr>
-        <w:t>and</w:t>
+        <w:t/>
+      </w:r>
+      <w:r>
+        <w:rPr>
+          <w:color w:val="212121"/>
+        </w:rPr>
+        <w:t/>
       </w:r>
       <w:r>
         <w:rPr>
           <w:color w:val="212121"/>
           <w:spacing w:val="-4"/>
         </w:rPr>
-        <w:t> </w:t>
-      </w:r>
-      <w:r>
-        <w:rPr>
-          <w:color w:val="212121"/>
-        </w:rPr>
-        <w:t>validated</w:t>
+        <w:t/>
+      </w:r>
+      <w:r>
+        <w:rPr>
+          <w:color w:val="212121"/>
+        </w:rPr>
+        <w:t/>
       </w:r>
       <w:r>
         <w:rPr>
           <w:color w:val="212121"/>
           <w:spacing w:val="-3"/>
         </w:rPr>
-        <w:t> </w:t>
-      </w:r>
-      <w:r>
-        <w:rPr>
-          <w:color w:val="212121"/>
-        </w:rPr>
-        <w:t>today,</w:t>
+        <w:t/>
+      </w:r>
+      <w:r>
+        <w:rPr>
+          <w:color w:val="212121"/>
+        </w:rPr>
+        <w:t/>
       </w:r>
       <w:r>
         <w:rPr>
           <w:color w:val="212121"/>
           <w:spacing w:val="-1"/>
         </w:rPr>
-        <w:t> </w:t>
-      </w:r>
-      <w:r>
-        <w:rPr>
-          <w:color w:val="212121"/>
-        </w:rPr>
-        <w:t>entirely</w:t>
+        <w:t/>
+      </w:r>
+      <w:r>
+        <w:rPr>
+          <w:color w:val="212121"/>
+        </w:rPr>
+        <w:t/>
       </w:r>
       <w:r>
         <w:rPr>
           <w:color w:val="212121"/>
           <w:spacing w:val="-1"/>
         </w:rPr>
-        <w:t> </w:t>
-      </w:r>
-      <w:r>
-        <w:rPr>
-          <w:color w:val="212121"/>
-        </w:rPr>
-        <w:t>from</w:t>
+        <w:t/>
+      </w:r>
+      <w:r>
+        <w:rPr>
+          <w:color w:val="212121"/>
+        </w:rPr>
+        <w:t/>
       </w:r>
       <w:r>
         <w:rPr>
           <w:color w:val="212121"/>
           <w:spacing w:val="-2"/>
         </w:rPr>
-        <w:t> </w:t>
-      </w:r>
-      <w:r>
-        <w:rPr>
-          <w:color w:val="212121"/>
-        </w:rPr>
-        <w:t>public data, and stands ready for direct transfer to Libya's own grid once equivalent local data becomes publicly </w:t>
+        <w:t/>
+      </w:r>
+      <w:r>
+        <w:rPr>
+          <w:color w:val="212121"/>
+        </w:rPr>
+        <w:t/>
       </w:r>
       <w:r>
         <w:rPr>
           <w:color w:val="212121"/>
           <w:spacing w:val="-2"/>
         </w:rPr>
-        <w:t>available.</w:t>
+        <w:t/>
       </w:r>
     </w:p>
     <w:p>
@@ -35185,7 +35227,24 @@
 </w:document>
 </file>
 
-<file path=word/footer1.xml><?xml version="1.0" encoding="utf-8"?>
+<file path=word\fontTable.xml><?xml version="1.0" encoding="utf-8"?>
+<w:fonts xmlns:r="http://schemas.openxmlformats.org/officeDocument/2006/relationships" xmlns:w="http://schemas.openxmlformats.org/wordprocessingml/2006/main">
+  <w:font w:name="Times New Roman">
+    <w:altName w:val="Times New Roman"/>
+    <w:charset w:val="1"/>
+    <w:family w:val="roman"/>
+    <w:pitch w:val="variable"/>
+  </w:font>
+  <w:font w:name="Calibri">
+    <w:altName w:val="Calibri"/>
+    <w:charset w:val="1"/>
+    <w:family w:val="swiss"/>
+    <w:pitch w:val="variable"/>
+  </w:font>
+</w:fonts>
+</file>
+
+<file path=word\footer1.xml><?xml version="1.0" encoding="utf-8"?>
 <w:ftr xmlns:mc="http://schemas.openxmlformats.org/markup-compatibility/2006" xmlns:ve="http://schemas.openxmlformats.org/markup-compatibility/2006" xmlns:o="urn:schemas-microsoft-com:office:office" xmlns:r="http://schemas.openxmlformats.org/officeDocument/2006/relationships" xmlns:m="http://schemas.openxmlformats.org/officeDocument/2006/math" xmlns:v="urn:schemas-microsoft-com:vml" xmlns:wp="http://schemas.openxmlformats.org/drawingml/2006/wordprocessingDrawing" xmlns:w10="urn:schemas-microsoft-com:office:word" xmlns:w="http://schemas.openxmlformats.org/wordprocessingml/2006/main" xmlns:wne="http://schemas.microsoft.com/office/word/2006/wordml" xmlns:a="http://schemas.openxmlformats.org/drawingml/2006/main" xmlns:pic="http://schemas.openxmlformats.org/drawingml/2006/picture" xmlns:wpg="http://schemas.microsoft.com/office/word/2010/wordprocessingGroup" xmlns:wps="http://schemas.microsoft.com/office/word/2010/wordprocessingShape" xmlns:w14="http://schemas.microsoft.com/office/word/2010/wordml" mc:Ignorable="w14" xml:space="preserve">
   <w:p>
     <w:pPr>
@@ -35391,7 +35450,7 @@
 </w:ftr>
 </file>
 
-<file path=word/footer2.xml><?xml version="1.0" encoding="utf-8"?>
+<file path=word\footer2.xml><?xml version="1.0" encoding="utf-8"?>
 <w:ftr xmlns:mc="http://schemas.openxmlformats.org/markup-compatibility/2006" xmlns:ve="http://schemas.openxmlformats.org/markup-compatibility/2006" xmlns:o="urn:schemas-microsoft-com:office:office" xmlns:r="http://schemas.openxmlformats.org/officeDocument/2006/relationships" xmlns:m="http://schemas.openxmlformats.org/officeDocument/2006/math" xmlns:v="urn:schemas-microsoft-com:vml" xmlns:wp="http://schemas.openxmlformats.org/drawingml/2006/wordprocessingDrawing" xmlns:w10="urn:schemas-microsoft-com:office:word" xmlns:w="http://schemas.openxmlformats.org/wordprocessingml/2006/main" xmlns:wne="http://schemas.microsoft.com/office/word/2006/wordml" xmlns:a="http://schemas.openxmlformats.org/drawingml/2006/main" xmlns:pic="http://schemas.openxmlformats.org/drawingml/2006/picture" xmlns:wpg="http://schemas.microsoft.com/office/word/2010/wordprocessingGroup" xmlns:wps="http://schemas.microsoft.com/office/word/2010/wordprocessingShape" xmlns:w14="http://schemas.microsoft.com/office/word/2010/wordml" mc:Ignorable="w14" xml:space="preserve">
   <w:p>
     <w:pPr>
@@ -35597,7 +35656,7 @@
 </w:ftr>
 </file>
 
-<file path=word/header1.xml><?xml version="1.0" encoding="utf-8"?>
+<file path=word\header1.xml><?xml version="1.0" encoding="utf-8"?>
 <w:hdr xmlns:mc="http://schemas.openxmlformats.org/markup-compatibility/2006" xmlns:ve="http://schemas.openxmlformats.org/markup-compatibility/2006" xmlns:o="urn:schemas-microsoft-com:office:office" xmlns:r="http://schemas.openxmlformats.org/officeDocument/2006/relationships" xmlns:m="http://schemas.openxmlformats.org/officeDocument/2006/math" xmlns:v="urn:schemas-microsoft-com:vml" xmlns:wp="http://schemas.openxmlformats.org/drawingml/2006/wordprocessingDrawing" xmlns:w10="urn:schemas-microsoft-com:office:word" xmlns:w="http://schemas.openxmlformats.org/wordprocessingml/2006/main" xmlns:wne="http://schemas.microsoft.com/office/word/2006/wordml" xmlns:a="http://schemas.openxmlformats.org/drawingml/2006/main" xmlns:pic="http://schemas.openxmlformats.org/drawingml/2006/picture" xmlns:wpg="http://schemas.microsoft.com/office/word/2010/wordprocessingGroup" xmlns:wps="http://schemas.microsoft.com/office/word/2010/wordprocessingShape" xmlns:w14="http://schemas.microsoft.com/office/word/2010/wordml" mc:Ignorable="w14" xml:space="preserve">
   <w:p>
     <w:pPr>
@@ -35819,7 +35878,7 @@
 </w:hdr>
 </file>
 
-<file path=word/header2.xml><?xml version="1.0" encoding="utf-8"?>
+<file path=word\header2.xml><?xml version="1.0" encoding="utf-8"?>
 <w:hdr xmlns:mc="http://schemas.openxmlformats.org/markup-compatibility/2006" xmlns:ve="http://schemas.openxmlformats.org/markup-compatibility/2006" xmlns:o="urn:schemas-microsoft-com:office:office" xmlns:r="http://schemas.openxmlformats.org/officeDocument/2006/relationships" xmlns:m="http://schemas.openxmlformats.org/officeDocument/2006/math" xmlns:v="urn:schemas-microsoft-com:vml" xmlns:wp="http://schemas.openxmlformats.org/drawingml/2006/wordprocessingDrawing" xmlns:w10="urn:schemas-microsoft-com:office:word" xmlns:w="http://schemas.openxmlformats.org/wordprocessingml/2006/main" xmlns:wne="http://schemas.microsoft.com/office/word/2006/wordml" xmlns:a="http://schemas.openxmlformats.org/drawingml/2006/main" xmlns:pic="http://schemas.openxmlformats.org/drawingml/2006/picture" xmlns:wpg="http://schemas.microsoft.com/office/word/2010/wordprocessingGroup" xmlns:wps="http://schemas.microsoft.com/office/word/2010/wordprocessingShape" xmlns:w14="http://schemas.microsoft.com/office/word/2010/wordml" mc:Ignorable="w14" xml:space="preserve">
   <w:p>
     <w:pPr>
@@ -36037,7 +36096,7 @@
 </w:hdr>
 </file>
 
-<file path=word/numbering.xml><?xml version="1.0" encoding="utf-8"?>
+<file path=word\numbering.xml><?xml version="1.0" encoding="utf-8"?>
 <w:numbering xmlns:ve="http://schemas.openxmlformats.org/markup-compatibility/2006" xmlns:o="urn:schemas-microsoft-com:office:office" xmlns:r="http://schemas.openxmlformats.org/officeDocument/2006/relationships" xmlns:m="http://schemas.openxmlformats.org/officeDocument/2006/math" xmlns:v="urn:schemas-microsoft-com:vml" xmlns:wp="http://schemas.openxmlformats.org/drawingml/2006/wordprocessingDrawing" xmlns:w10="urn:schemas-microsoft-com:office:word" xmlns:w="http://schemas.openxmlformats.org/wordprocessingml/2006/main" xmlns:wne="http://schemas.microsoft.com/office/word/2006/wordml">
   <w:abstractNum w:abstractNumId="12">
     <w:multiLevelType w:val="hybridMultilevel"/>
@@ -37856,7 +37915,23 @@
 </w:numbering>
 </file>
 
-<file path=word/styles.xml><?xml version="1.0" encoding="utf-8"?>
+<file path=word\settings.xml><?xml version="1.0" encoding="utf-8"?>
+<w:settings xmlns:o="urn:schemas-microsoft-com:office:office" xmlns:r="http://schemas.openxmlformats.org/officeDocument/2006/relationships" xmlns:m="http://schemas.openxmlformats.org/officeDocument/2006/math" xmlns:v="urn:schemas-microsoft-com:vml" xmlns:w10="urn:schemas-microsoft-com:office:word" xmlns:w="http://schemas.openxmlformats.org/wordprocessingml/2006/main" xmlns:sl="http://schemas.openxmlformats.org/schemaLibrary/2006/main">
+  <w:zoom w:percent="120"/>
+  <w:defaultTabStop w:val="720"/>
+  <w:drawingGridHorizontalSpacing w:val="110"/>
+  <w:displayHorizontalDrawingGridEvery w:val="2"/>
+  <w:characterSpacingControl w:val="doNotCompress"/>
+  <w:compat>
+    <w:ulTrailSpace/>
+    <w:shapeLayoutLikeWW8/>
+    <w:useFELayout/>
+    <w:compatSetting w:val="14" w:uri="http://schemas.microsoft.com/office/word" w:name="compatibilityMode"/>
+  </w:compat>
+</w:settings>
+</file>
+
+<file path=word\styles.xml><?xml version="1.0" encoding="utf-8"?>
 <w:styles xmlns:r="http://schemas.openxmlformats.org/officeDocument/2006/relationships" xmlns:w="http://schemas.openxmlformats.org/wordprocessingml/2006/main">
   <w:docDefaults>
     <w:rPrDefault>
@@ -38165,7 +38240,7 @@
 </w:styles>
 </file>
 
-<file path=word/theme/theme1.xml><?xml version="1.0" encoding="utf-8"?>
+<file path=word\theme\theme1.xml><?xml version="1.0" encoding="utf-8"?>
 <a:theme xmlns:a="http://schemas.openxmlformats.org/drawingml/2006/main" name="Office Theme">
   <a:themeElements>
     <a:clrScheme name="Office">

</xml_diff>